<commit_message>
docs(skripsi): nomor Romawi bagian awal dipindah ke tengah bawah
Sebelumnya nomor Romawi dipasang di kanan atas karena pedoman 3.4 hanya
menyebut "halaman bab baru" sebagai pengecualian. Pembacaan itu terlalu
sempit: Daftar Isi, Daftar Gambar, dan Daftar Tabel adalah judul setara
bab, jadi halamannya termasuk ketentuan tengah bawah.

Bagian awal kini memakai header kosong dan footer rata tengah di seluruh
halamannya; halaman judul tetap dihitung i tanpa nomor tercetak. Bagian
inti tidak berubah.

cek_format_docx.py memisahkan aturan per bagian dan menambah pemeriksaan
baru: bagian awal tidak boleh ikut bernomor di kanan atas.

Hasil: berkas lengkap LULUS 20 GAGAL 0; empat berkas lain LULUS 17 GAGAL 0.

Co-Authored-By: Claude Opus 5 <noreply@anthropic.com>
Claude-Session: https://claude.ai/code/session_014GBfxg8CEGrkQBN8xs6kmP
</commit_message>
<xml_diff>
--- a/skripsi/proposal-skripsi-lengkap.docx
+++ b/skripsi/proposal-skripsi-lengkap.docx
@@ -2208,9 +2208,9 @@
       <w:pPr>
         <w:sectPr>
           <w:headerReference w:type="first" r:id="rId3"/>
-          <w:headerReference w:type="default" r:id="rId4"/>
+          <w:headerReference w:type="default" r:id="rId3"/>
           <w:footerReference w:type="first" r:id="rId5"/>
-          <w:footerReference w:type="default" r:id="rId5"/>
+          <w:footerReference w:type="default" r:id="rId6"/>
           <w:type w:val="nextPage"/>
           <w:pgSz w:w="11906" w:h="16838"/>
           <w:pgMar w:top="1701" w:right="1701" w:bottom="1701" w:left="2268" w:header="850" w:footer="850" w:gutter="0"/>

</xml_diff>